<commit_message>
introducting crowding in proxies
</commit_message>
<xml_diff>
--- a/output/regv2proxy_Baseline_BBsample.docx
+++ b/output/regv2proxy_Baseline_BBsample.docx
@@ -7,16 +7,77 @@
         <w:tblStyle w:val="TableGrid"/>
       </w:tblPr>
       <w:tblGrid>
-        <w:gridCol w:w="4680"/>
-        <w:gridCol w:w="4680"/>
+        <w:gridCol w:w="3120"/>
+        <w:gridCol w:w="3120"/>
+        <w:gridCol w:w="3120"/>
       </w:tblGrid>
       <w:tr>
         <w:tc>
           <w:tcPr>
-            <w:tcW w:w="4680" w:type="dxa"/>
+            <w:tcW w:w="3120" w:type="dxa"/>
             <w:tcBorders>
               <w:top w:val="single" w:color="000000"/>
               <w:left w:val="nil" w:color="000000"/>
+              <w:bottom w:val="single" w:color="000000"/>
+              <w:right w:val="single" w:color="000000"/>
+            </w:tcBorders>
+          </w:tcPr>
+          <w:p>
+            <w:pPr>
+              <w:spacing w:after="0"/>
+            </w:pPr>
+          </w:p>
+        </w:tc>
+        <w:tc>
+          <w:tcPr>
+            <w:tcW w:w="3120" w:type="dxa"/>
+            <w:tcBorders>
+              <w:top w:val="single" w:color="000000"/>
+              <w:left w:val="single" w:color="000000"/>
+              <w:bottom w:val="single" w:color="000000"/>
+              <w:right w:val="nil" w:color="000000"/>
+            </w:tcBorders>
+            <w:vAlign w:val="bottom"/>
+          </w:tcPr>
+          <w:p>
+            <w:pPr>
+              <w:spacing w:after="0"/>
+              <w:jc w:val="right"/>
+            </w:pPr>
+            <w:r>
+              <w:t xml:space="preserve">2</w:t>
+            </w:r>
+          </w:p>
+        </w:tc>
+        <w:tc>
+          <w:tcPr>
+            <w:tcW w:w="3120" w:type="dxa"/>
+            <w:tcBorders>
+              <w:top w:val="single" w:color="000000"/>
+              <w:left w:val="nil" w:color="000000"/>
+              <w:bottom w:val="single" w:color="000000"/>
+              <w:right w:val="nil" w:color="000000"/>
+            </w:tcBorders>
+            <w:vAlign w:val="bottom"/>
+          </w:tcPr>
+          <w:p>
+            <w:pPr>
+              <w:spacing w:after="0"/>
+              <w:jc w:val="right"/>
+            </w:pPr>
+            <w:r>
+              <w:t xml:space="preserve">1</w:t>
+            </w:r>
+          </w:p>
+        </w:tc>
+      </w:tr>
+      <w:tr>
+        <w:tc>
+          <w:tcPr>
+            <w:tcW w:w="3120" w:type="dxa"/>
+            <w:tcBorders>
+              <w:top w:val="single" w:color="000000"/>
+              <w:left w:val="nil" w:color="000000"/>
               <w:bottom w:val="nil" w:color="000000"/>
               <w:right w:val="single" w:color="000000"/>
             </w:tcBorders>
@@ -34,7 +95,7 @@
         </w:tc>
         <w:tc>
           <w:tcPr>
-            <w:tcW w:w="4680" w:type="dxa"/>
+            <w:tcW w:w="3120" w:type="dxa"/>
             <w:tcBorders>
               <w:top w:val="single" w:color="000000"/>
               <w:left w:val="single" w:color="000000"/>
@@ -49,6 +110,27 @@
               <w:jc w:val="center"/>
             </w:pPr>
             <w:r>
+              <w:t xml:space="preserve">0.14***</w:t>
+            </w:r>
+          </w:p>
+        </w:tc>
+        <w:tc>
+          <w:tcPr>
+            <w:tcW w:w="3120" w:type="dxa"/>
+            <w:tcBorders>
+              <w:top w:val="single" w:color="000000"/>
+              <w:left w:val="nil" w:color="000000"/>
+              <w:bottom w:val="nil" w:color="000000"/>
+              <w:right w:val="nil" w:color="000000"/>
+            </w:tcBorders>
+            <w:vAlign w:val="bottom"/>
+          </w:tcPr>
+          <w:p>
+            <w:pPr>
+              <w:spacing w:after="0"/>
+              <w:jc w:val="center"/>
+            </w:pPr>
+            <w:r>
               <w:t xml:space="preserve">0.12***</w:t>
             </w:r>
           </w:p>
@@ -57,26 +139,47 @@
       <w:tr>
         <w:tc>
           <w:tcPr>
-            <w:tcW w:w="4680" w:type="dxa"/>
-            <w:tcBorders>
-              <w:top w:val="nil" w:color="000000"/>
-              <w:left w:val="nil" w:color="000000"/>
-              <w:bottom w:val="nil" w:color="000000"/>
-              <w:right w:val="single" w:color="000000"/>
-            </w:tcBorders>
-          </w:tcPr>
-          <w:p>
-            <w:pPr>
-              <w:spacing w:after="0"/>
-            </w:pPr>
-          </w:p>
-        </w:tc>
-        <w:tc>
-          <w:tcPr>
-            <w:tcW w:w="4680" w:type="dxa"/>
-            <w:tcBorders>
-              <w:top w:val="nil" w:color="000000"/>
-              <w:left w:val="single" w:color="000000"/>
+            <w:tcW w:w="3120" w:type="dxa"/>
+            <w:tcBorders>
+              <w:top w:val="nil" w:color="000000"/>
+              <w:left w:val="nil" w:color="000000"/>
+              <w:bottom w:val="nil" w:color="000000"/>
+              <w:right w:val="single" w:color="000000"/>
+            </w:tcBorders>
+          </w:tcPr>
+          <w:p>
+            <w:pPr>
+              <w:spacing w:after="0"/>
+            </w:pPr>
+          </w:p>
+        </w:tc>
+        <w:tc>
+          <w:tcPr>
+            <w:tcW w:w="3120" w:type="dxa"/>
+            <w:tcBorders>
+              <w:top w:val="nil" w:color="000000"/>
+              <w:left w:val="single" w:color="000000"/>
+              <w:bottom w:val="nil" w:color="000000"/>
+              <w:right w:val="nil" w:color="000000"/>
+            </w:tcBorders>
+            <w:vAlign w:val="bottom"/>
+          </w:tcPr>
+          <w:p>
+            <w:pPr>
+              <w:spacing w:after="0"/>
+              <w:jc w:val="center"/>
+            </w:pPr>
+            <w:r>
+              <w:t xml:space="preserve">[0.04,0.24]</w:t>
+            </w:r>
+          </w:p>
+        </w:tc>
+        <w:tc>
+          <w:tcPr>
+            <w:tcW w:w="3120" w:type="dxa"/>
+            <w:tcBorders>
+              <w:top w:val="nil" w:color="000000"/>
+              <w:left w:val="nil" w:color="000000"/>
               <w:bottom w:val="nil" w:color="000000"/>
               <w:right w:val="nil" w:color="000000"/>
             </w:tcBorders>
@@ -96,7 +199,7 @@
       <w:tr>
         <w:tc>
           <w:tcPr>
-            <w:tcW w:w="4680" w:type="dxa"/>
+            <w:tcW w:w="3120" w:type="dxa"/>
             <w:tcBorders>
               <w:top w:val="nil" w:color="000000"/>
               <w:left w:val="nil" w:color="000000"/>
@@ -117,69 +220,111 @@
         </w:tc>
         <w:tc>
           <w:tcPr>
-            <w:tcW w:w="4680" w:type="dxa"/>
-            <w:tcBorders>
-              <w:top w:val="nil" w:color="000000"/>
-              <w:left w:val="single" w:color="000000"/>
-              <w:bottom w:val="nil" w:color="000000"/>
-              <w:right w:val="nil" w:color="000000"/>
-            </w:tcBorders>
-            <w:vAlign w:val="bottom"/>
-          </w:tcPr>
-          <w:p>
-            <w:pPr>
-              <w:spacing w:after="0"/>
-              <w:jc w:val="center"/>
-            </w:pPr>
-            <w:r>
-              <w:t xml:space="preserve">-1.20***</w:t>
-            </w:r>
-          </w:p>
-        </w:tc>
-      </w:tr>
-      <w:tr>
-        <w:tc>
-          <w:tcPr>
-            <w:tcW w:w="4680" w:type="dxa"/>
-            <w:tcBorders>
-              <w:top w:val="nil" w:color="000000"/>
-              <w:left w:val="nil" w:color="000000"/>
-              <w:bottom w:val="nil" w:color="000000"/>
-              <w:right w:val="single" w:color="000000"/>
-            </w:tcBorders>
-          </w:tcPr>
-          <w:p>
-            <w:pPr>
-              <w:spacing w:after="0"/>
-            </w:pPr>
-          </w:p>
-        </w:tc>
-        <w:tc>
-          <w:tcPr>
-            <w:tcW w:w="4680" w:type="dxa"/>
-            <w:tcBorders>
-              <w:top w:val="nil" w:color="000000"/>
-              <w:left w:val="single" w:color="000000"/>
-              <w:bottom w:val="nil" w:color="000000"/>
-              <w:right w:val="nil" w:color="000000"/>
-            </w:tcBorders>
-            <w:vAlign w:val="bottom"/>
-          </w:tcPr>
-          <w:p>
-            <w:pPr>
-              <w:spacing w:after="0"/>
-              <w:jc w:val="center"/>
-            </w:pPr>
-            <w:r>
-              <w:t xml:space="preserve">[-1.57,-0.83]</w:t>
-            </w:r>
-          </w:p>
-        </w:tc>
-      </w:tr>
-      <w:tr>
-        <w:tc>
-          <w:tcPr>
-            <w:tcW w:w="4680" w:type="dxa"/>
+            <w:tcW w:w="3120" w:type="dxa"/>
+            <w:tcBorders>
+              <w:top w:val="nil" w:color="000000"/>
+              <w:left w:val="single" w:color="000000"/>
+              <w:bottom w:val="nil" w:color="000000"/>
+              <w:right w:val="nil" w:color="000000"/>
+            </w:tcBorders>
+            <w:vAlign w:val="bottom"/>
+          </w:tcPr>
+          <w:p>
+            <w:pPr>
+              <w:spacing w:after="0"/>
+              <w:jc w:val="center"/>
+            </w:pPr>
+            <w:r>
+              <w:t xml:space="preserve">-1.16***</w:t>
+            </w:r>
+          </w:p>
+        </w:tc>
+        <w:tc>
+          <w:tcPr>
+            <w:tcW w:w="3120" w:type="dxa"/>
+            <w:tcBorders>
+              <w:top w:val="nil" w:color="000000"/>
+              <w:left w:val="nil" w:color="000000"/>
+              <w:bottom w:val="nil" w:color="000000"/>
+              <w:right w:val="nil" w:color="000000"/>
+            </w:tcBorders>
+            <w:vAlign w:val="bottom"/>
+          </w:tcPr>
+          <w:p>
+            <w:pPr>
+              <w:spacing w:after="0"/>
+              <w:jc w:val="center"/>
+            </w:pPr>
+            <w:r>
+              <w:t xml:space="preserve">-1.19***</w:t>
+            </w:r>
+          </w:p>
+        </w:tc>
+      </w:tr>
+      <w:tr>
+        <w:tc>
+          <w:tcPr>
+            <w:tcW w:w="3120" w:type="dxa"/>
+            <w:tcBorders>
+              <w:top w:val="nil" w:color="000000"/>
+              <w:left w:val="nil" w:color="000000"/>
+              <w:bottom w:val="nil" w:color="000000"/>
+              <w:right w:val="single" w:color="000000"/>
+            </w:tcBorders>
+          </w:tcPr>
+          <w:p>
+            <w:pPr>
+              <w:spacing w:after="0"/>
+            </w:pPr>
+          </w:p>
+        </w:tc>
+        <w:tc>
+          <w:tcPr>
+            <w:tcW w:w="3120" w:type="dxa"/>
+            <w:tcBorders>
+              <w:top w:val="nil" w:color="000000"/>
+              <w:left w:val="single" w:color="000000"/>
+              <w:bottom w:val="nil" w:color="000000"/>
+              <w:right w:val="nil" w:color="000000"/>
+            </w:tcBorders>
+            <w:vAlign w:val="bottom"/>
+          </w:tcPr>
+          <w:p>
+            <w:pPr>
+              <w:spacing w:after="0"/>
+              <w:jc w:val="center"/>
+            </w:pPr>
+            <w:r>
+              <w:t xml:space="preserve">[-1.56,-0.75]</w:t>
+            </w:r>
+          </w:p>
+        </w:tc>
+        <w:tc>
+          <w:tcPr>
+            <w:tcW w:w="3120" w:type="dxa"/>
+            <w:tcBorders>
+              <w:top w:val="nil" w:color="000000"/>
+              <w:left w:val="nil" w:color="000000"/>
+              <w:bottom w:val="nil" w:color="000000"/>
+              <w:right w:val="nil" w:color="000000"/>
+            </w:tcBorders>
+            <w:vAlign w:val="bottom"/>
+          </w:tcPr>
+          <w:p>
+            <w:pPr>
+              <w:spacing w:after="0"/>
+              <w:jc w:val="center"/>
+            </w:pPr>
+            <w:r>
+              <w:t xml:space="preserve">[-1.56,-0.82]</w:t>
+            </w:r>
+          </w:p>
+        </w:tc>
+      </w:tr>
+      <w:tr>
+        <w:tc>
+          <w:tcPr>
+            <w:tcW w:w="3120" w:type="dxa"/>
             <w:tcBorders>
               <w:top w:val="nil" w:color="000000"/>
               <w:left w:val="nil" w:color="000000"/>
@@ -200,10 +345,31 @@
         </w:tc>
         <w:tc>
           <w:tcPr>
-            <w:tcW w:w="4680" w:type="dxa"/>
-            <w:tcBorders>
-              <w:top w:val="nil" w:color="000000"/>
-              <w:left w:val="single" w:color="000000"/>
+            <w:tcW w:w="3120" w:type="dxa"/>
+            <w:tcBorders>
+              <w:top w:val="nil" w:color="000000"/>
+              <w:left w:val="single" w:color="000000"/>
+              <w:bottom w:val="nil" w:color="000000"/>
+              <w:right w:val="nil" w:color="000000"/>
+            </w:tcBorders>
+            <w:vAlign w:val="bottom"/>
+          </w:tcPr>
+          <w:p>
+            <w:pPr>
+              <w:spacing w:after="0"/>
+              <w:jc w:val="center"/>
+            </w:pPr>
+            <w:r>
+              <w:t xml:space="preserve">-0.27***</w:t>
+            </w:r>
+          </w:p>
+        </w:tc>
+        <w:tc>
+          <w:tcPr>
+            <w:tcW w:w="3120" w:type="dxa"/>
+            <w:tcBorders>
+              <w:top w:val="nil" w:color="000000"/>
+              <w:left w:val="nil" w:color="000000"/>
               <w:bottom w:val="nil" w:color="000000"/>
               <w:right w:val="nil" w:color="000000"/>
             </w:tcBorders>
@@ -223,46 +389,67 @@
       <w:tr>
         <w:tc>
           <w:tcPr>
-            <w:tcW w:w="4680" w:type="dxa"/>
-            <w:tcBorders>
-              <w:top w:val="nil" w:color="000000"/>
-              <w:left w:val="nil" w:color="000000"/>
-              <w:bottom w:val="nil" w:color="000000"/>
-              <w:right w:val="single" w:color="000000"/>
-            </w:tcBorders>
-          </w:tcPr>
-          <w:p>
-            <w:pPr>
-              <w:spacing w:after="0"/>
-            </w:pPr>
-          </w:p>
-        </w:tc>
-        <w:tc>
-          <w:tcPr>
-            <w:tcW w:w="4680" w:type="dxa"/>
-            <w:tcBorders>
-              <w:top w:val="nil" w:color="000000"/>
-              <w:left w:val="single" w:color="000000"/>
-              <w:bottom w:val="nil" w:color="000000"/>
-              <w:right w:val="nil" w:color="000000"/>
-            </w:tcBorders>
-            <w:vAlign w:val="bottom"/>
-          </w:tcPr>
-          <w:p>
-            <w:pPr>
-              <w:spacing w:after="0"/>
-              <w:jc w:val="center"/>
-            </w:pPr>
-            <w:r>
-              <w:t xml:space="preserve">[-0.31,-0.08]</w:t>
-            </w:r>
-          </w:p>
-        </w:tc>
-      </w:tr>
-      <w:tr>
-        <w:tc>
-          <w:tcPr>
-            <w:tcW w:w="4680" w:type="dxa"/>
+            <w:tcW w:w="3120" w:type="dxa"/>
+            <w:tcBorders>
+              <w:top w:val="nil" w:color="000000"/>
+              <w:left w:val="nil" w:color="000000"/>
+              <w:bottom w:val="nil" w:color="000000"/>
+              <w:right w:val="single" w:color="000000"/>
+            </w:tcBorders>
+          </w:tcPr>
+          <w:p>
+            <w:pPr>
+              <w:spacing w:after="0"/>
+            </w:pPr>
+          </w:p>
+        </w:tc>
+        <w:tc>
+          <w:tcPr>
+            <w:tcW w:w="3120" w:type="dxa"/>
+            <w:tcBorders>
+              <w:top w:val="nil" w:color="000000"/>
+              <w:left w:val="single" w:color="000000"/>
+              <w:bottom w:val="nil" w:color="000000"/>
+              <w:right w:val="nil" w:color="000000"/>
+            </w:tcBorders>
+            <w:vAlign w:val="bottom"/>
+          </w:tcPr>
+          <w:p>
+            <w:pPr>
+              <w:spacing w:after="0"/>
+              <w:jc w:val="center"/>
+            </w:pPr>
+            <w:r>
+              <w:t xml:space="preserve">[-0.42,-0.13]</w:t>
+            </w:r>
+          </w:p>
+        </w:tc>
+        <w:tc>
+          <w:tcPr>
+            <w:tcW w:w="3120" w:type="dxa"/>
+            <w:tcBorders>
+              <w:top w:val="nil" w:color="000000"/>
+              <w:left w:val="nil" w:color="000000"/>
+              <w:bottom w:val="nil" w:color="000000"/>
+              <w:right w:val="nil" w:color="000000"/>
+            </w:tcBorders>
+            <w:vAlign w:val="bottom"/>
+          </w:tcPr>
+          <w:p>
+            <w:pPr>
+              <w:spacing w:after="0"/>
+              <w:jc w:val="center"/>
+            </w:pPr>
+            <w:r>
+              <w:t xml:space="preserve">[-0.30,-0.08]</w:t>
+            </w:r>
+          </w:p>
+        </w:tc>
+      </w:tr>
+      <w:tr>
+        <w:tc>
+          <w:tcPr>
+            <w:tcW w:w="3120" w:type="dxa"/>
             <w:tcBorders>
               <w:top w:val="nil" w:color="000000"/>
               <w:left w:val="nil" w:color="000000"/>
@@ -283,7 +470,7 @@
         </w:tc>
         <w:tc>
           <w:tcPr>
-            <w:tcW w:w="4680" w:type="dxa"/>
+            <w:tcW w:w="3120" w:type="dxa"/>
             <w:tcBorders>
               <w:top w:val="nil" w:color="000000"/>
               <w:left w:val="single" w:color="000000"/>
@@ -302,27 +489,48 @@
             </w:r>
           </w:p>
         </w:tc>
-      </w:tr>
-      <w:tr>
-        <w:tc>
-          <w:tcPr>
-            <w:tcW w:w="4680" w:type="dxa"/>
-            <w:tcBorders>
-              <w:top w:val="nil" w:color="000000"/>
-              <w:left w:val="nil" w:color="000000"/>
-              <w:bottom w:val="nil" w:color="000000"/>
-              <w:right w:val="single" w:color="000000"/>
-            </w:tcBorders>
-          </w:tcPr>
-          <w:p>
-            <w:pPr>
-              <w:spacing w:after="0"/>
-            </w:pPr>
-          </w:p>
-        </w:tc>
-        <w:tc>
-          <w:tcPr>
-            <w:tcW w:w="4680" w:type="dxa"/>
+        <w:tc>
+          <w:tcPr>
+            <w:tcW w:w="3120" w:type="dxa"/>
+            <w:tcBorders>
+              <w:top w:val="nil" w:color="000000"/>
+              <w:left w:val="nil" w:color="000000"/>
+              <w:bottom w:val="nil" w:color="000000"/>
+              <w:right w:val="nil" w:color="000000"/>
+            </w:tcBorders>
+            <w:vAlign w:val="bottom"/>
+          </w:tcPr>
+          <w:p>
+            <w:pPr>
+              <w:spacing w:after="0"/>
+              <w:jc w:val="center"/>
+            </w:pPr>
+            <w:r>
+              <w:t xml:space="preserve">-0.02</w:t>
+            </w:r>
+          </w:p>
+        </w:tc>
+      </w:tr>
+      <w:tr>
+        <w:tc>
+          <w:tcPr>
+            <w:tcW w:w="3120" w:type="dxa"/>
+            <w:tcBorders>
+              <w:top w:val="nil" w:color="000000"/>
+              <w:left w:val="nil" w:color="000000"/>
+              <w:bottom w:val="nil" w:color="000000"/>
+              <w:right w:val="single" w:color="000000"/>
+            </w:tcBorders>
+          </w:tcPr>
+          <w:p>
+            <w:pPr>
+              <w:spacing w:after="0"/>
+            </w:pPr>
+          </w:p>
+        </w:tc>
+        <w:tc>
+          <w:tcPr>
+            <w:tcW w:w="3120" w:type="dxa"/>
             <w:tcBorders>
               <w:top w:val="nil" w:color="000000"/>
               <w:left w:val="single" w:color="000000"/>
@@ -341,11 +549,32 @@
             </w:r>
           </w:p>
         </w:tc>
-      </w:tr>
-      <w:tr>
-        <w:tc>
-          <w:tcPr>
-            <w:tcW w:w="4680" w:type="dxa"/>
+        <w:tc>
+          <w:tcPr>
+            <w:tcW w:w="3120" w:type="dxa"/>
+            <w:tcBorders>
+              <w:top w:val="nil" w:color="000000"/>
+              <w:left w:val="nil" w:color="000000"/>
+              <w:bottom w:val="nil" w:color="000000"/>
+              <w:right w:val="nil" w:color="000000"/>
+            </w:tcBorders>
+            <w:vAlign w:val="bottom"/>
+          </w:tcPr>
+          <w:p>
+            <w:pPr>
+              <w:spacing w:after="0"/>
+              <w:jc w:val="center"/>
+            </w:pPr>
+            <w:r>
+              <w:t xml:space="preserve">[-0.06,0.02]</w:t>
+            </w:r>
+          </w:p>
+        </w:tc>
+      </w:tr>
+      <w:tr>
+        <w:tc>
+          <w:tcPr>
+            <w:tcW w:w="3120" w:type="dxa"/>
             <w:tcBorders>
               <w:top w:val="nil" w:color="000000"/>
               <w:left w:val="nil" w:color="000000"/>
@@ -366,69 +595,111 @@
         </w:tc>
         <w:tc>
           <w:tcPr>
-            <w:tcW w:w="4680" w:type="dxa"/>
-            <w:tcBorders>
-              <w:top w:val="nil" w:color="000000"/>
-              <w:left w:val="single" w:color="000000"/>
-              <w:bottom w:val="nil" w:color="000000"/>
-              <w:right w:val="nil" w:color="000000"/>
-            </w:tcBorders>
-            <w:vAlign w:val="bottom"/>
-          </w:tcPr>
-          <w:p>
-            <w:pPr>
-              <w:spacing w:after="0"/>
-              <w:jc w:val="center"/>
-            </w:pPr>
-            <w:r>
-              <w:t xml:space="preserve">-0.19***</w:t>
-            </w:r>
-          </w:p>
-        </w:tc>
-      </w:tr>
-      <w:tr>
-        <w:tc>
-          <w:tcPr>
-            <w:tcW w:w="4680" w:type="dxa"/>
-            <w:tcBorders>
-              <w:top w:val="nil" w:color="000000"/>
-              <w:left w:val="nil" w:color="000000"/>
-              <w:bottom w:val="nil" w:color="000000"/>
-              <w:right w:val="single" w:color="000000"/>
-            </w:tcBorders>
-          </w:tcPr>
-          <w:p>
-            <w:pPr>
-              <w:spacing w:after="0"/>
-            </w:pPr>
-          </w:p>
-        </w:tc>
-        <w:tc>
-          <w:tcPr>
-            <w:tcW w:w="4680" w:type="dxa"/>
-            <w:tcBorders>
-              <w:top w:val="nil" w:color="000000"/>
-              <w:left w:val="single" w:color="000000"/>
-              <w:bottom w:val="nil" w:color="000000"/>
-              <w:right w:val="nil" w:color="000000"/>
-            </w:tcBorders>
-            <w:vAlign w:val="bottom"/>
-          </w:tcPr>
-          <w:p>
-            <w:pPr>
-              <w:spacing w:after="0"/>
-              <w:jc w:val="center"/>
-            </w:pPr>
-            <w:r>
-              <w:t xml:space="preserve">[-0.31,-0.07]</w:t>
-            </w:r>
-          </w:p>
-        </w:tc>
-      </w:tr>
-      <w:tr>
-        <w:tc>
-          <w:tcPr>
-            <w:tcW w:w="4680" w:type="dxa"/>
+            <w:tcW w:w="3120" w:type="dxa"/>
+            <w:tcBorders>
+              <w:top w:val="nil" w:color="000000"/>
+              <w:left w:val="single" w:color="000000"/>
+              <w:bottom w:val="nil" w:color="000000"/>
+              <w:right w:val="nil" w:color="000000"/>
+            </w:tcBorders>
+            <w:vAlign w:val="bottom"/>
+          </w:tcPr>
+          <w:p>
+            <w:pPr>
+              <w:spacing w:after="0"/>
+              <w:jc w:val="center"/>
+            </w:pPr>
+            <w:r>
+              <w:t xml:space="preserve">-0.27***</w:t>
+            </w:r>
+          </w:p>
+        </w:tc>
+        <w:tc>
+          <w:tcPr>
+            <w:tcW w:w="3120" w:type="dxa"/>
+            <w:tcBorders>
+              <w:top w:val="nil" w:color="000000"/>
+              <w:left w:val="nil" w:color="000000"/>
+              <w:bottom w:val="nil" w:color="000000"/>
+              <w:right w:val="nil" w:color="000000"/>
+            </w:tcBorders>
+            <w:vAlign w:val="bottom"/>
+          </w:tcPr>
+          <w:p>
+            <w:pPr>
+              <w:spacing w:after="0"/>
+              <w:jc w:val="center"/>
+            </w:pPr>
+            <w:r>
+              <w:t xml:space="preserve">-0.21***</w:t>
+            </w:r>
+          </w:p>
+        </w:tc>
+      </w:tr>
+      <w:tr>
+        <w:tc>
+          <w:tcPr>
+            <w:tcW w:w="3120" w:type="dxa"/>
+            <w:tcBorders>
+              <w:top w:val="nil" w:color="000000"/>
+              <w:left w:val="nil" w:color="000000"/>
+              <w:bottom w:val="nil" w:color="000000"/>
+              <w:right w:val="single" w:color="000000"/>
+            </w:tcBorders>
+          </w:tcPr>
+          <w:p>
+            <w:pPr>
+              <w:spacing w:after="0"/>
+            </w:pPr>
+          </w:p>
+        </w:tc>
+        <w:tc>
+          <w:tcPr>
+            <w:tcW w:w="3120" w:type="dxa"/>
+            <w:tcBorders>
+              <w:top w:val="nil" w:color="000000"/>
+              <w:left w:val="single" w:color="000000"/>
+              <w:bottom w:val="nil" w:color="000000"/>
+              <w:right w:val="nil" w:color="000000"/>
+            </w:tcBorders>
+            <w:vAlign w:val="bottom"/>
+          </w:tcPr>
+          <w:p>
+            <w:pPr>
+              <w:spacing w:after="0"/>
+              <w:jc w:val="center"/>
+            </w:pPr>
+            <w:r>
+              <w:t xml:space="preserve">[-0.42,-0.13]</w:t>
+            </w:r>
+          </w:p>
+        </w:tc>
+        <w:tc>
+          <w:tcPr>
+            <w:tcW w:w="3120" w:type="dxa"/>
+            <w:tcBorders>
+              <w:top w:val="nil" w:color="000000"/>
+              <w:left w:val="nil" w:color="000000"/>
+              <w:bottom w:val="nil" w:color="000000"/>
+              <w:right w:val="nil" w:color="000000"/>
+            </w:tcBorders>
+            <w:vAlign w:val="bottom"/>
+          </w:tcPr>
+          <w:p>
+            <w:pPr>
+              <w:spacing w:after="0"/>
+              <w:jc w:val="center"/>
+            </w:pPr>
+            <w:r>
+              <w:t xml:space="preserve">[-0.32,-0.09]</w:t>
+            </w:r>
+          </w:p>
+        </w:tc>
+      </w:tr>
+      <w:tr>
+        <w:tc>
+          <w:tcPr>
+            <w:tcW w:w="3120" w:type="dxa"/>
             <w:tcBorders>
               <w:top w:val="nil" w:color="000000"/>
               <w:left w:val="nil" w:color="000000"/>
@@ -449,25 +720,41 @@
         </w:tc>
         <w:tc>
           <w:tcPr>
-            <w:tcW w:w="4680" w:type="dxa"/>
-            <w:tcBorders>
-              <w:top w:val="nil" w:color="000000"/>
-              <w:left w:val="single" w:color="000000"/>
-              <w:bottom w:val="nil" w:color="000000"/>
-              <w:right w:val="nil" w:color="000000"/>
-            </w:tcBorders>
-          </w:tcPr>
-          <w:p>
-            <w:pPr>
-              <w:spacing w:after="0"/>
-            </w:pPr>
-          </w:p>
-        </w:tc>
-      </w:tr>
-      <w:tr>
-        <w:tc>
-          <w:tcPr>
-            <w:tcW w:w="4680" w:type="dxa"/>
+            <w:tcW w:w="3120" w:type="dxa"/>
+            <w:tcBorders>
+              <w:top w:val="nil" w:color="000000"/>
+              <w:left w:val="single" w:color="000000"/>
+              <w:bottom w:val="nil" w:color="000000"/>
+              <w:right w:val="nil" w:color="000000"/>
+            </w:tcBorders>
+          </w:tcPr>
+          <w:p>
+            <w:pPr>
+              <w:spacing w:after="0"/>
+            </w:pPr>
+          </w:p>
+        </w:tc>
+        <w:tc>
+          <w:tcPr>
+            <w:tcW w:w="3120" w:type="dxa"/>
+            <w:tcBorders>
+              <w:top w:val="nil" w:color="000000"/>
+              <w:left w:val="nil" w:color="000000"/>
+              <w:bottom w:val="nil" w:color="000000"/>
+              <w:right w:val="nil" w:color="000000"/>
+            </w:tcBorders>
+          </w:tcPr>
+          <w:p>
+            <w:pPr>
+              <w:spacing w:after="0"/>
+            </w:pPr>
+          </w:p>
+        </w:tc>
+      </w:tr>
+      <w:tr>
+        <w:tc>
+          <w:tcPr>
+            <w:tcW w:w="3120" w:type="dxa"/>
             <w:tcBorders>
               <w:top w:val="nil" w:color="000000"/>
               <w:left w:val="nil" w:color="000000"/>
@@ -488,30 +775,111 @@
         </w:tc>
         <w:tc>
           <w:tcPr>
-            <w:tcW w:w="4680" w:type="dxa"/>
-            <w:tcBorders>
-              <w:top w:val="nil" w:color="000000"/>
-              <w:left w:val="single" w:color="000000"/>
-              <w:bottom w:val="nil" w:color="000000"/>
-              <w:right w:val="nil" w:color="000000"/>
-            </w:tcBorders>
-            <w:vAlign w:val="bottom"/>
-          </w:tcPr>
-          <w:p>
-            <w:pPr>
-              <w:spacing w:after="0"/>
-              <w:jc w:val="center"/>
-            </w:pPr>
-            <w:r>
-              <w:t xml:space="preserve">0.00</w:t>
-            </w:r>
-          </w:p>
-        </w:tc>
-      </w:tr>
-      <w:tr>
-        <w:tc>
-          <w:tcPr>
-            <w:tcW w:w="4680" w:type="dxa"/>
+            <w:tcW w:w="3120" w:type="dxa"/>
+            <w:tcBorders>
+              <w:top w:val="nil" w:color="000000"/>
+              <w:left w:val="single" w:color="000000"/>
+              <w:bottom w:val="nil" w:color="000000"/>
+              <w:right w:val="nil" w:color="000000"/>
+            </w:tcBorders>
+            <w:vAlign w:val="bottom"/>
+          </w:tcPr>
+          <w:p>
+            <w:pPr>
+              <w:spacing w:after="0"/>
+              <w:jc w:val="center"/>
+            </w:pPr>
+            <w:r>
+              <w:t xml:space="preserve">-0.07</w:t>
+            </w:r>
+          </w:p>
+        </w:tc>
+        <w:tc>
+          <w:tcPr>
+            <w:tcW w:w="3120" w:type="dxa"/>
+            <w:tcBorders>
+              <w:top w:val="nil" w:color="000000"/>
+              <w:left w:val="nil" w:color="000000"/>
+              <w:bottom w:val="nil" w:color="000000"/>
+              <w:right w:val="nil" w:color="000000"/>
+            </w:tcBorders>
+            <w:vAlign w:val="bottom"/>
+          </w:tcPr>
+          <w:p>
+            <w:pPr>
+              <w:spacing w:after="0"/>
+              <w:jc w:val="center"/>
+            </w:pPr>
+            <w:r>
+              <w:t xml:space="preserve">-0.02</w:t>
+            </w:r>
+          </w:p>
+        </w:tc>
+      </w:tr>
+      <w:tr>
+        <w:tc>
+          <w:tcPr>
+            <w:tcW w:w="3120" w:type="dxa"/>
+            <w:tcBorders>
+              <w:top w:val="nil" w:color="000000"/>
+              <w:left w:val="nil" w:color="000000"/>
+              <w:bottom w:val="nil" w:color="000000"/>
+              <w:right w:val="single" w:color="000000"/>
+            </w:tcBorders>
+          </w:tcPr>
+          <w:p>
+            <w:pPr>
+              <w:spacing w:after="0"/>
+            </w:pPr>
+          </w:p>
+        </w:tc>
+        <w:tc>
+          <w:tcPr>
+            <w:tcW w:w="3120" w:type="dxa"/>
+            <w:tcBorders>
+              <w:top w:val="nil" w:color="000000"/>
+              <w:left w:val="single" w:color="000000"/>
+              <w:bottom w:val="nil" w:color="000000"/>
+              <w:right w:val="nil" w:color="000000"/>
+            </w:tcBorders>
+            <w:vAlign w:val="bottom"/>
+          </w:tcPr>
+          <w:p>
+            <w:pPr>
+              <w:spacing w:after="0"/>
+              <w:jc w:val="center"/>
+            </w:pPr>
+            <w:r>
+              <w:t xml:space="preserve">[-0.31,0.17]</w:t>
+            </w:r>
+          </w:p>
+        </w:tc>
+        <w:tc>
+          <w:tcPr>
+            <w:tcW w:w="3120" w:type="dxa"/>
+            <w:tcBorders>
+              <w:top w:val="nil" w:color="000000"/>
+              <w:left w:val="nil" w:color="000000"/>
+              <w:bottom w:val="nil" w:color="000000"/>
+              <w:right w:val="nil" w:color="000000"/>
+            </w:tcBorders>
+            <w:vAlign w:val="bottom"/>
+          </w:tcPr>
+          <w:p>
+            <w:pPr>
+              <w:spacing w:after="0"/>
+              <w:jc w:val="center"/>
+            </w:pPr>
+            <w:r>
+              <w:t xml:space="preserve">[-0.23,0.18]</w:t>
+            </w:r>
+          </w:p>
+        </w:tc>
+      </w:tr>
+      <w:tr>
+        <w:tc>
+          <w:tcPr>
+            <w:tcW w:w="3120" w:type="dxa"/>
             <w:tcBorders>
               <w:top w:val="nil" w:color="000000"/>
               <w:left w:val="nil" w:color="000000"/>
@@ -526,75 +894,232 @@
               <w:jc w:val="left"/>
             </w:pPr>
             <w:r>
+              <w:t xml:space="preserve">Number of embarked enslaved people per ton</w:t>
+            </w:r>
+          </w:p>
+        </w:tc>
+        <w:tc>
+          <w:tcPr>
+            <w:tcW w:w="3120" w:type="dxa"/>
+            <w:tcBorders>
+              <w:top w:val="nil" w:color="000000"/>
+              <w:left w:val="single" w:color="000000"/>
+              <w:bottom w:val="nil" w:color="000000"/>
+              <w:right w:val="nil" w:color="000000"/>
+            </w:tcBorders>
+            <w:vAlign w:val="bottom"/>
+          </w:tcPr>
+          <w:p>
+            <w:pPr>
+              <w:spacing w:after="0"/>
+              <w:jc w:val="center"/>
+            </w:pPr>
+            <w:r>
+              <w:t xml:space="preserve">-0.10**</w:t>
+            </w:r>
+          </w:p>
+        </w:tc>
+        <w:tc>
+          <w:tcPr>
+            <w:tcW w:w="3120" w:type="dxa"/>
+            <w:tcBorders>
+              <w:top w:val="nil" w:color="000000"/>
+              <w:left w:val="nil" w:color="000000"/>
+              <w:bottom w:val="nil" w:color="000000"/>
+              <w:right w:val="nil" w:color="000000"/>
+            </w:tcBorders>
+          </w:tcPr>
+          <w:p>
+            <w:pPr>
+              <w:spacing w:after="0"/>
+            </w:pPr>
+          </w:p>
+        </w:tc>
+      </w:tr>
+      <w:tr>
+        <w:tc>
+          <w:tcPr>
+            <w:tcW w:w="3120" w:type="dxa"/>
+            <w:tcBorders>
+              <w:top w:val="nil" w:color="000000"/>
+              <w:left w:val="nil" w:color="000000"/>
+              <w:bottom w:val="nil" w:color="000000"/>
+              <w:right w:val="single" w:color="000000"/>
+            </w:tcBorders>
+          </w:tcPr>
+          <w:p>
+            <w:pPr>
+              <w:spacing w:after="0"/>
+            </w:pPr>
+          </w:p>
+        </w:tc>
+        <w:tc>
+          <w:tcPr>
+            <w:tcW w:w="3120" w:type="dxa"/>
+            <w:tcBorders>
+              <w:top w:val="nil" w:color="000000"/>
+              <w:left w:val="single" w:color="000000"/>
+              <w:bottom w:val="nil" w:color="000000"/>
+              <w:right w:val="nil" w:color="000000"/>
+            </w:tcBorders>
+            <w:vAlign w:val="bottom"/>
+          </w:tcPr>
+          <w:p>
+            <w:pPr>
+              <w:spacing w:after="0"/>
+              <w:jc w:val="center"/>
+            </w:pPr>
+            <w:r>
+              <w:t xml:space="preserve">[-0.20,-0.01]</w:t>
+            </w:r>
+          </w:p>
+        </w:tc>
+        <w:tc>
+          <w:tcPr>
+            <w:tcW w:w="3120" w:type="dxa"/>
+            <w:tcBorders>
+              <w:top w:val="nil" w:color="000000"/>
+              <w:left w:val="nil" w:color="000000"/>
+              <w:bottom w:val="nil" w:color="000000"/>
+              <w:right w:val="nil" w:color="000000"/>
+            </w:tcBorders>
+          </w:tcPr>
+          <w:p>
+            <w:pPr>
+              <w:spacing w:after="0"/>
+            </w:pPr>
+          </w:p>
+        </w:tc>
+      </w:tr>
+      <w:tr>
+        <w:tc>
+          <w:tcPr>
+            <w:tcW w:w="3120" w:type="dxa"/>
+            <w:tcBorders>
+              <w:top w:val="nil" w:color="000000"/>
+              <w:left w:val="nil" w:color="000000"/>
+              <w:bottom w:val="nil" w:color="000000"/>
+              <w:right w:val="single" w:color="000000"/>
+            </w:tcBorders>
+            <w:vAlign w:val="bottom"/>
+          </w:tcPr>
+          <w:p>
+            <w:pPr>
+              <w:spacing w:after="0"/>
+              <w:jc w:val="left"/>
+            </w:pPr>
+            <w:r>
               <w:t xml:space="preserve">Intercept</w:t>
             </w:r>
           </w:p>
         </w:tc>
         <w:tc>
           <w:tcPr>
-            <w:tcW w:w="4680" w:type="dxa"/>
-            <w:tcBorders>
-              <w:top w:val="nil" w:color="000000"/>
-              <w:left w:val="single" w:color="000000"/>
-              <w:bottom w:val="nil" w:color="000000"/>
-              <w:right w:val="nil" w:color="000000"/>
-            </w:tcBorders>
-            <w:vAlign w:val="bottom"/>
-          </w:tcPr>
-          <w:p>
-            <w:pPr>
-              <w:spacing w:after="0"/>
-              <w:jc w:val="center"/>
-            </w:pPr>
-            <w:r>
-              <w:t xml:space="preserve">2.29***</w:t>
-            </w:r>
-          </w:p>
-        </w:tc>
-      </w:tr>
-      <w:tr>
-        <w:tc>
-          <w:tcPr>
-            <w:tcW w:w="4680" w:type="dxa"/>
-            <w:tcBorders>
-              <w:top w:val="nil" w:color="000000"/>
-              <w:left w:val="nil" w:color="000000"/>
-              <w:bottom w:val="nil" w:color="000000"/>
-              <w:right w:val="single" w:color="000000"/>
-            </w:tcBorders>
-          </w:tcPr>
-          <w:p>
-            <w:pPr>
-              <w:spacing w:after="0"/>
-            </w:pPr>
-          </w:p>
-        </w:tc>
-        <w:tc>
-          <w:tcPr>
-            <w:tcW w:w="4680" w:type="dxa"/>
-            <w:tcBorders>
-              <w:top w:val="nil" w:color="000000"/>
-              <w:left w:val="single" w:color="000000"/>
-              <w:bottom w:val="nil" w:color="000000"/>
-              <w:right w:val="nil" w:color="000000"/>
-            </w:tcBorders>
-            <w:vAlign w:val="bottom"/>
-          </w:tcPr>
-          <w:p>
-            <w:pPr>
-              <w:spacing w:after="0"/>
-              <w:jc w:val="center"/>
-            </w:pPr>
-            <w:r>
-              <w:t xml:space="preserve">[1.12,3.46]</w:t>
-            </w:r>
-          </w:p>
-        </w:tc>
-      </w:tr>
-      <w:tr>
-        <w:tc>
-          <w:tcPr>
-            <w:tcW w:w="4680" w:type="dxa"/>
+            <w:tcW w:w="3120" w:type="dxa"/>
+            <w:tcBorders>
+              <w:top w:val="nil" w:color="000000"/>
+              <w:left w:val="single" w:color="000000"/>
+              <w:bottom w:val="nil" w:color="000000"/>
+              <w:right w:val="nil" w:color="000000"/>
+            </w:tcBorders>
+            <w:vAlign w:val="bottom"/>
+          </w:tcPr>
+          <w:p>
+            <w:pPr>
+              <w:spacing w:after="0"/>
+              <w:jc w:val="center"/>
+            </w:pPr>
+            <w:r>
+              <w:t xml:space="preserve">3.49***</w:t>
+            </w:r>
+          </w:p>
+        </w:tc>
+        <w:tc>
+          <w:tcPr>
+            <w:tcW w:w="3120" w:type="dxa"/>
+            <w:tcBorders>
+              <w:top w:val="nil" w:color="000000"/>
+              <w:left w:val="nil" w:color="000000"/>
+              <w:bottom w:val="nil" w:color="000000"/>
+              <w:right w:val="nil" w:color="000000"/>
+            </w:tcBorders>
+            <w:vAlign w:val="bottom"/>
+          </w:tcPr>
+          <w:p>
+            <w:pPr>
+              <w:spacing w:after="0"/>
+              <w:jc w:val="center"/>
+            </w:pPr>
+            <w:r>
+              <w:t xml:space="preserve">2.36***</w:t>
+            </w:r>
+          </w:p>
+        </w:tc>
+      </w:tr>
+      <w:tr>
+        <w:tc>
+          <w:tcPr>
+            <w:tcW w:w="3120" w:type="dxa"/>
+            <w:tcBorders>
+              <w:top w:val="nil" w:color="000000"/>
+              <w:left w:val="nil" w:color="000000"/>
+              <w:bottom w:val="nil" w:color="000000"/>
+              <w:right w:val="single" w:color="000000"/>
+            </w:tcBorders>
+          </w:tcPr>
+          <w:p>
+            <w:pPr>
+              <w:spacing w:after="0"/>
+            </w:pPr>
+          </w:p>
+        </w:tc>
+        <w:tc>
+          <w:tcPr>
+            <w:tcW w:w="3120" w:type="dxa"/>
+            <w:tcBorders>
+              <w:top w:val="nil" w:color="000000"/>
+              <w:left w:val="single" w:color="000000"/>
+              <w:bottom w:val="nil" w:color="000000"/>
+              <w:right w:val="nil" w:color="000000"/>
+            </w:tcBorders>
+            <w:vAlign w:val="bottom"/>
+          </w:tcPr>
+          <w:p>
+            <w:pPr>
+              <w:spacing w:after="0"/>
+              <w:jc w:val="center"/>
+            </w:pPr>
+            <w:r>
+              <w:t xml:space="preserve">[1.82,5.16]</w:t>
+            </w:r>
+          </w:p>
+        </w:tc>
+        <w:tc>
+          <w:tcPr>
+            <w:tcW w:w="3120" w:type="dxa"/>
+            <w:tcBorders>
+              <w:top w:val="nil" w:color="000000"/>
+              <w:left w:val="nil" w:color="000000"/>
+              <w:bottom w:val="nil" w:color="000000"/>
+              <w:right w:val="nil" w:color="000000"/>
+            </w:tcBorders>
+            <w:vAlign w:val="bottom"/>
+          </w:tcPr>
+          <w:p>
+            <w:pPr>
+              <w:spacing w:after="0"/>
+              <w:jc w:val="center"/>
+            </w:pPr>
+            <w:r>
+              <w:t xml:space="preserve">[1.16,3.56]</w:t>
+            </w:r>
+          </w:p>
+        </w:tc>
+      </w:tr>
+      <w:tr>
+        <w:tc>
+          <w:tcPr>
+            <w:tcW w:w="3120" w:type="dxa"/>
             <w:tcBorders>
               <w:top w:val="nil" w:color="000000"/>
               <w:left w:val="nil" w:color="000000"/>
@@ -615,30 +1140,51 @@
         </w:tc>
         <w:tc>
           <w:tcPr>
-            <w:tcW w:w="4680" w:type="dxa"/>
-            <w:tcBorders>
-              <w:top w:val="nil" w:color="000000"/>
-              <w:left w:val="single" w:color="000000"/>
-              <w:bottom w:val="nil" w:color="000000"/>
-              <w:right w:val="nil" w:color="000000"/>
-            </w:tcBorders>
-            <w:vAlign w:val="bottom"/>
-          </w:tcPr>
-          <w:p>
-            <w:pPr>
-              <w:spacing w:after="0"/>
-              <w:jc w:val="center"/>
-            </w:pPr>
-            <w:r>
-              <w:t xml:space="preserve">254</w:t>
-            </w:r>
-          </w:p>
-        </w:tc>
-      </w:tr>
-      <w:tr>
-        <w:tc>
-          <w:tcPr>
-            <w:tcW w:w="4680" w:type="dxa"/>
+            <w:tcW w:w="3120" w:type="dxa"/>
+            <w:tcBorders>
+              <w:top w:val="nil" w:color="000000"/>
+              <w:left w:val="single" w:color="000000"/>
+              <w:bottom w:val="nil" w:color="000000"/>
+              <w:right w:val="nil" w:color="000000"/>
+            </w:tcBorders>
+            <w:vAlign w:val="bottom"/>
+          </w:tcPr>
+          <w:p>
+            <w:pPr>
+              <w:spacing w:after="0"/>
+              <w:jc w:val="center"/>
+            </w:pPr>
+            <w:r>
+              <w:t xml:space="preserve">242</w:t>
+            </w:r>
+          </w:p>
+        </w:tc>
+        <w:tc>
+          <w:tcPr>
+            <w:tcW w:w="3120" w:type="dxa"/>
+            <w:tcBorders>
+              <w:top w:val="nil" w:color="000000"/>
+              <w:left w:val="nil" w:color="000000"/>
+              <w:bottom w:val="nil" w:color="000000"/>
+              <w:right w:val="nil" w:color="000000"/>
+            </w:tcBorders>
+            <w:vAlign w:val="bottom"/>
+          </w:tcPr>
+          <w:p>
+            <w:pPr>
+              <w:spacing w:after="0"/>
+              <w:jc w:val="center"/>
+            </w:pPr>
+            <w:r>
+              <w:t xml:space="preserve">258</w:t>
+            </w:r>
+          </w:p>
+        </w:tc>
+      </w:tr>
+      <w:tr>
+        <w:tc>
+          <w:tcPr>
+            <w:tcW w:w="3120" w:type="dxa"/>
             <w:tcBorders>
               <w:top w:val="nil" w:color="000000"/>
               <w:left w:val="nil" w:color="000000"/>
@@ -659,10 +1205,31 @@
         </w:tc>
         <w:tc>
           <w:tcPr>
-            <w:tcW w:w="4680" w:type="dxa"/>
-            <w:tcBorders>
-              <w:top w:val="nil" w:color="000000"/>
-              <w:left w:val="single" w:color="000000"/>
+            <w:tcW w:w="3120" w:type="dxa"/>
+            <w:tcBorders>
+              <w:top w:val="nil" w:color="000000"/>
+              <w:left w:val="single" w:color="000000"/>
+              <w:bottom w:val="nil" w:color="000000"/>
+              <w:right w:val="nil" w:color="000000"/>
+            </w:tcBorders>
+            <w:vAlign w:val="bottom"/>
+          </w:tcPr>
+          <w:p>
+            <w:pPr>
+              <w:spacing w:after="0"/>
+              <w:jc w:val="center"/>
+            </w:pPr>
+            <w:r>
+              <w:t xml:space="preserve">0.28</w:t>
+            </w:r>
+          </w:p>
+        </w:tc>
+        <w:tc>
+          <w:tcPr>
+            <w:tcW w:w="3120" w:type="dxa"/>
+            <w:tcBorders>
+              <w:top w:val="nil" w:color="000000"/>
+              <w:left w:val="nil" w:color="000000"/>
               <w:bottom w:val="nil" w:color="000000"/>
               <w:right w:val="nil" w:color="000000"/>
             </w:tcBorders>
@@ -682,7 +1249,7 @@
       <w:tr>
         <w:tc>
           <w:tcPr>
-            <w:tcW w:w="4680" w:type="dxa"/>
+            <w:tcW w:w="3120" w:type="dxa"/>
             <w:tcBorders>
               <w:top w:val="nil" w:color="000000"/>
               <w:left w:val="nil" w:color="000000"/>
@@ -703,10 +1270,31 @@
         </w:tc>
         <w:tc>
           <w:tcPr>
-            <w:tcW w:w="4680" w:type="dxa"/>
-            <w:tcBorders>
-              <w:top w:val="nil" w:color="000000"/>
-              <w:left w:val="single" w:color="000000"/>
+            <w:tcW w:w="3120" w:type="dxa"/>
+            <w:tcBorders>
+              <w:top w:val="nil" w:color="000000"/>
+              <w:left w:val="single" w:color="000000"/>
+              <w:bottom w:val="single" w:color="000000"/>
+              <w:right w:val="nil" w:color="000000"/>
+            </w:tcBorders>
+            <w:vAlign w:val="bottom"/>
+          </w:tcPr>
+          <w:p>
+            <w:pPr>
+              <w:spacing w:after="0"/>
+              <w:jc w:val="center"/>
+            </w:pPr>
+            <w:r>
+              <w:t xml:space="preserve">0.26</w:t>
+            </w:r>
+          </w:p>
+        </w:tc>
+        <w:tc>
+          <w:tcPr>
+            <w:tcW w:w="3120" w:type="dxa"/>
+            <w:tcBorders>
+              <w:top w:val="nil" w:color="000000"/>
+              <w:left w:val="nil" w:color="000000"/>
               <w:bottom w:val="single" w:color="000000"/>
               <w:right w:val="nil" w:color="000000"/>
             </w:tcBorders>

</xml_diff>